<commit_message>
título, introducción y objetivos
</commit_message>
<xml_diff>
--- a/ANALISIS PROYECTO TETRIS.docx
+++ b/ANALISIS PROYECTO TETRIS.docx
@@ -5,24 +5,655 @@
     <w:p>
       <w:pPr>
         <w:rPr>
-          <w:lang w:val="es-CO"/>
-        </w:rPr>
-      </w:pPr>
-      <w:r>
-        <w:rPr>
-          <w:lang w:val="es-CO"/>
-        </w:rPr>
-        <w:t xml:space="preserve">ANALISIS PROYECTO TETRIS </w:t>
-      </w:r>
+          <w:rFonts w:ascii="Arial" w:hAnsi="Arial" w:cs="Arial"/>
+          <w:b/>
+          <w:bCs/>
+          <w:lang w:val="es-CO"/>
+        </w:rPr>
+      </w:pPr>
+      <w:r>
+        <w:rPr>
+          <w:rFonts w:ascii="Arial" w:hAnsi="Arial" w:cs="Arial"/>
+          <w:b/>
+          <w:bCs/>
+          <w:lang w:val="es-CO"/>
+        </w:rPr>
+        <w:t>Análisis del juego Tetris utilizando manipulación de bits en C++</w:t>
+      </w:r>
+    </w:p>
+    <w:p>
+      <w:pPr>
+        <w:rPr>
+          <w:rFonts w:ascii="Arial" w:hAnsi="Arial" w:cs="Arial"/>
+          <w:b/>
+          <w:bCs/>
+          <w:lang w:val="es-CO"/>
+        </w:rPr>
+      </w:pPr>
+    </w:p>
+    <w:p>
+      <w:pPr>
+        <w:ind w:left="5040" w:firstLine="720"/>
+        <w:rPr>
+          <w:rFonts w:ascii="Arial" w:hAnsi="Arial" w:cs="Arial"/>
+          <w:lang w:val="es-CO"/>
+        </w:rPr>
+      </w:pPr>
+      <w:r>
+        <w:rPr>
+          <w:rFonts w:ascii="Arial" w:hAnsi="Arial" w:cs="Arial"/>
+          <w:lang w:val="es-CO"/>
+        </w:rPr>
+        <w:t>Bernardo Antonio Patiño Arroyave</w:t>
+      </w:r>
+    </w:p>
+    <w:p>
+      <w:pPr>
+        <w:ind w:left="5040" w:firstLine="720"/>
+        <w:rPr>
+          <w:rFonts w:ascii="Arial" w:hAnsi="Arial" w:cs="Arial"/>
+          <w:lang w:val="es-CO"/>
+        </w:rPr>
+      </w:pPr>
+      <w:r>
+        <w:rPr>
+          <w:rFonts w:ascii="Arial" w:hAnsi="Arial" w:cs="Arial"/>
+          <w:lang w:val="es-CO"/>
+        </w:rPr>
+        <w:t>Informática</w:t>
+      </w:r>
+      <w:r>
+        <w:rPr>
+          <w:rFonts w:ascii="Arial" w:hAnsi="Arial" w:cs="Arial"/>
+          <w:lang w:val="es-CO"/>
+        </w:rPr>
+        <w:t xml:space="preserve"> </w:t>
+      </w:r>
+      <w:r>
+        <w:rPr>
+          <w:rFonts w:ascii="Arial" w:hAnsi="Arial" w:cs="Arial"/>
+          <w:lang w:val="es-CO"/>
+        </w:rPr>
+        <w:t>II Desafío</w:t>
+      </w:r>
+      <w:r>
+        <w:rPr>
+          <w:rFonts w:ascii="Arial" w:hAnsi="Arial" w:cs="Arial"/>
+          <w:lang w:val="es-CO"/>
+        </w:rPr>
+        <w:t xml:space="preserve"> uno  </w:t>
+      </w:r>
+    </w:p>
+    <w:p>
+      <w:pPr>
+        <w:rPr>
+          <w:rFonts w:ascii="Arial" w:hAnsi="Arial" w:cs="Arial"/>
+          <w:lang w:val="es-CO"/>
+        </w:rPr>
+      </w:pPr>
+      <w:r>
+        <w:rPr>
+          <w:rFonts w:ascii="Arial" w:hAnsi="Arial" w:cs="Arial"/>
+          <w:lang w:val="es-CO"/>
+        </w:rPr>
+        <w:t xml:space="preserve">                                                                                              </w:t>
+      </w:r>
+      <w:r>
+        <w:rPr>
+          <w:rFonts w:ascii="Arial" w:hAnsi="Arial" w:cs="Arial"/>
+          <w:lang w:val="es-CO"/>
+        </w:rPr>
+        <w:t xml:space="preserve">Profesor </w:t>
+      </w:r>
+      <w:r>
+        <w:rPr>
+          <w:rFonts w:ascii="Arial" w:hAnsi="Arial" w:cs="Arial"/>
+          <w:lang w:val="es-CO"/>
+        </w:rPr>
+        <w:t>Augusto Zalazar</w:t>
+      </w:r>
+      <w:r>
+        <w:rPr>
+          <w:rFonts w:ascii="Arial" w:hAnsi="Arial" w:cs="Arial"/>
+          <w:lang w:val="es-CO"/>
+        </w:rPr>
+        <w:t xml:space="preserve"> </w:t>
+      </w:r>
+    </w:p>
+    <w:p>
+      <w:pPr>
+        <w:rPr>
+          <w:rFonts w:ascii="Arial" w:hAnsi="Arial" w:cs="Arial"/>
+          <w:lang w:val="es-CO"/>
+        </w:rPr>
+      </w:pPr>
+      <w:r>
+        <w:rPr>
+          <w:rFonts w:ascii="Arial" w:hAnsi="Arial" w:cs="Arial"/>
+          <w:lang w:val="es-CO"/>
+        </w:rPr>
+        <w:t xml:space="preserve">                                                                                              </w:t>
+      </w:r>
+      <w:r>
+        <w:rPr>
+          <w:rFonts w:ascii="Arial" w:hAnsi="Arial" w:cs="Arial"/>
+          <w:lang w:val="es-CO"/>
+        </w:rPr>
+        <w:t xml:space="preserve">Facultad de Ingeniería </w:t>
+      </w:r>
+    </w:p>
+    <w:p>
+      <w:pPr>
+        <w:rPr>
+          <w:rFonts w:ascii="Arial" w:hAnsi="Arial" w:cs="Arial"/>
+          <w:lang w:val="es-CO"/>
+        </w:rPr>
+      </w:pPr>
+      <w:r>
+        <w:rPr>
+          <w:rFonts w:ascii="Arial" w:hAnsi="Arial" w:cs="Arial"/>
+          <w:lang w:val="es-CO"/>
+        </w:rPr>
+        <w:t xml:space="preserve">                                                                                              13</w:t>
+      </w:r>
+      <w:r>
+        <w:rPr>
+          <w:rFonts w:ascii="Arial" w:hAnsi="Arial" w:cs="Arial"/>
+          <w:lang w:val="es-CO"/>
+        </w:rPr>
+        <w:t xml:space="preserve"> de </w:t>
+      </w:r>
+      <w:r>
+        <w:rPr>
+          <w:rFonts w:ascii="Arial" w:hAnsi="Arial" w:cs="Arial"/>
+          <w:lang w:val="es-CO"/>
+        </w:rPr>
+        <w:t>marzo</w:t>
+      </w:r>
+      <w:r>
+        <w:rPr>
+          <w:rFonts w:ascii="Arial" w:hAnsi="Arial" w:cs="Arial"/>
+          <w:lang w:val="es-CO"/>
+        </w:rPr>
+        <w:t xml:space="preserve"> de 202</w:t>
+      </w:r>
+      <w:r>
+        <w:rPr>
+          <w:rFonts w:ascii="Arial" w:hAnsi="Arial" w:cs="Arial"/>
+          <w:lang w:val="es-CO"/>
+        </w:rPr>
+        <w:t>6</w:t>
+      </w:r>
+    </w:p>
+    <w:p>
+      <w:pPr>
+        <w:rPr>
+          <w:rFonts w:ascii="Arial" w:hAnsi="Arial" w:cs="Arial"/>
+          <w:lang w:val="es-CO"/>
+        </w:rPr>
+      </w:pPr>
+    </w:p>
+    <w:p>
+      <w:pPr>
+        <w:rPr>
+          <w:lang w:val="es-CO"/>
+        </w:rPr>
+      </w:pPr>
+    </w:p>
+    <w:p>
+      <w:pPr>
+        <w:rPr>
+          <w:b/>
+          <w:bCs/>
+          <w:lang w:val="es-CO"/>
+        </w:rPr>
+      </w:pPr>
+      <w:r>
+        <w:rPr>
+          <w:b/>
+          <w:bCs/>
+          <w:lang w:val="es-CO"/>
+        </w:rPr>
+        <w:t>Introducción</w:t>
+      </w:r>
+    </w:p>
+    <w:p>
+      <w:pPr>
+        <w:rPr>
+          <w:lang w:val="es-CO"/>
+        </w:rPr>
+      </w:pPr>
+      <w:r>
+        <w:rPr>
+          <w:lang w:val="es-CO"/>
+        </w:rPr>
+        <w:t xml:space="preserve">El presente trabajo tiene como objetivo analizar el desarrollo de una versión del juego Tetris utilizando el lenguaje de programación C++. En este proyecto se aplicarán conceptos vistos en clase </w:t>
+      </w:r>
+      <w:r>
+        <w:rPr>
+          <w:lang w:val="es-CO"/>
+        </w:rPr>
+        <w:t>como manipulación</w:t>
+      </w:r>
+      <w:r>
+        <w:rPr>
+          <w:lang w:val="es-CO"/>
+        </w:rPr>
+        <w:t xml:space="preserve"> de bits (</w:t>
+      </w:r>
+      <w:proofErr w:type="spellStart"/>
+      <w:r>
+        <w:rPr>
+          <w:lang w:val="es-CO"/>
+        </w:rPr>
+        <w:t>bitwise</w:t>
+      </w:r>
+      <w:proofErr w:type="spellEnd"/>
+      <w:r>
+        <w:rPr>
+          <w:lang w:val="es-CO"/>
+        </w:rPr>
+        <w:t xml:space="preserve">), uso de memoria dinámica y </w:t>
+      </w:r>
+      <w:r>
+        <w:rPr>
+          <w:lang w:val="es-CO"/>
+        </w:rPr>
+        <w:t>funciones, punteros</w:t>
+      </w:r>
+      <w:r>
+        <w:rPr>
+          <w:lang w:val="es-CO"/>
+        </w:rPr>
+        <w:t>.</w:t>
+      </w:r>
+    </w:p>
+    <w:p>
+      <w:pPr>
+        <w:rPr>
+          <w:lang w:val="es-CO"/>
+        </w:rPr>
+      </w:pPr>
+      <w:r>
+        <w:rPr>
+          <w:lang w:val="es-CO"/>
+        </w:rPr>
+        <w:t>El juego consistirá en un tablero donde aparecerán diferentes piezas que el usuario podrá mover hacia la izquierda, derecha, rotar o bajar. El programa deberá verificar las colisiones con los bordes del tablero o con otras piezas, y cuando una fila esté completamente llena deberá eliminarse.</w:t>
+      </w:r>
+    </w:p>
+    <w:p>
+      <w:pPr>
+        <w:rPr>
+          <w:lang w:val="es-CO"/>
+        </w:rPr>
+      </w:pPr>
+      <w:r>
+        <w:rPr>
+          <w:lang w:val="es-CO"/>
+        </w:rPr>
+        <w:t>Este proyecto permite aplicar conceptos de programación y estructuras de datos para desarrollar una solución que simule el funcionamiento básico del juego Tetris.</w:t>
+      </w:r>
+    </w:p>
+    <w:p>
+      <w:pPr>
+        <w:rPr>
+          <w:lang w:val="es-CO"/>
+        </w:rPr>
+      </w:pPr>
+    </w:p>
+    <w:p>
+      <w:pPr>
+        <w:rPr>
+          <w:b/>
+          <w:bCs/>
+          <w:lang w:val="es-CO"/>
+        </w:rPr>
+      </w:pPr>
+      <w:r>
+        <w:rPr>
+          <w:b/>
+          <w:bCs/>
+          <w:lang w:val="es-CO"/>
+        </w:rPr>
+        <w:t>Objetivo general</w:t>
+      </w:r>
+    </w:p>
+    <w:p>
+      <w:pPr>
+        <w:rPr>
+          <w:lang w:val="es-CO"/>
+        </w:rPr>
+      </w:pPr>
+      <w:r>
+        <w:rPr>
+          <w:lang w:val="es-CO"/>
+        </w:rPr>
+        <w:t xml:space="preserve">Desarrollar el análisis y diseño de una versión simplificada del juego Tetris en C++, utilizando operaciones </w:t>
+      </w:r>
+      <w:proofErr w:type="spellStart"/>
+      <w:r>
+        <w:rPr>
+          <w:lang w:val="es-CO"/>
+        </w:rPr>
+        <w:t>bitwise</w:t>
+      </w:r>
+      <w:proofErr w:type="spellEnd"/>
+      <w:r>
+        <w:rPr>
+          <w:lang w:val="es-CO"/>
+        </w:rPr>
+        <w:t xml:space="preserve"> y estructuras de datos para representar el tablero y las piezas del juego.</w:t>
+      </w:r>
+    </w:p>
+    <w:p>
+      <w:pPr>
+        <w:rPr>
+          <w:lang w:val="es-CO"/>
+        </w:rPr>
+      </w:pPr>
+    </w:p>
+    <w:p>
+      <w:pPr>
+        <w:rPr>
+          <w:b/>
+          <w:bCs/>
+          <w:lang w:val="es-CO"/>
+        </w:rPr>
+      </w:pPr>
+      <w:r>
+        <w:rPr>
+          <w:b/>
+          <w:bCs/>
+          <w:lang w:val="es-CO"/>
+        </w:rPr>
+        <w:t>Objetivos específicos</w:t>
+      </w:r>
+    </w:p>
+    <w:p>
+      <w:pPr>
+        <w:numPr>
+          <w:ilvl w:val="0"/>
+          <w:numId w:val="1"/>
+        </w:numPr>
+        <w:rPr>
+          <w:lang w:val="es-CO"/>
+        </w:rPr>
+      </w:pPr>
+      <w:r>
+        <w:rPr>
+          <w:lang w:val="es-CO"/>
+        </w:rPr>
+        <w:t>Analizar el funcionamiento básico del juego Tetris.</w:t>
+      </w:r>
+    </w:p>
+    <w:p>
+      <w:pPr>
+        <w:numPr>
+          <w:ilvl w:val="0"/>
+          <w:numId w:val="1"/>
+        </w:numPr>
+        <w:rPr>
+          <w:lang w:val="es-CO"/>
+        </w:rPr>
+      </w:pPr>
+      <w:r>
+        <w:rPr>
+          <w:lang w:val="es-CO"/>
+        </w:rPr>
+        <w:t>Diseñar la estructura del tablero y la representación de las piezas.</w:t>
+      </w:r>
+    </w:p>
+    <w:p>
+      <w:pPr>
+        <w:numPr>
+          <w:ilvl w:val="0"/>
+          <w:numId w:val="1"/>
+        </w:numPr>
+        <w:rPr>
+          <w:lang w:val="es-CO"/>
+        </w:rPr>
+      </w:pPr>
+      <w:r>
+        <w:rPr>
+          <w:lang w:val="es-CO"/>
+        </w:rPr>
+        <w:t xml:space="preserve">Aplicar operaciones </w:t>
+      </w:r>
+      <w:proofErr w:type="spellStart"/>
+      <w:r>
+        <w:rPr>
+          <w:lang w:val="es-CO"/>
+        </w:rPr>
+        <w:t>bitwise</w:t>
+      </w:r>
+      <w:proofErr w:type="spellEnd"/>
+      <w:r>
+        <w:rPr>
+          <w:lang w:val="es-CO"/>
+        </w:rPr>
+        <w:t xml:space="preserve"> para manipular las piezas dentro del tablero.</w:t>
+      </w:r>
+    </w:p>
+    <w:p>
+      <w:pPr>
+        <w:numPr>
+          <w:ilvl w:val="0"/>
+          <w:numId w:val="1"/>
+        </w:numPr>
+        <w:rPr>
+          <w:lang w:val="es-CO"/>
+        </w:rPr>
+      </w:pPr>
+      <w:r>
+        <w:rPr>
+          <w:lang w:val="es-CO"/>
+        </w:rPr>
+        <w:t>Utilizar memoria dinámica para crear el tablero con dimensiones definidas por el usuario.</w:t>
+      </w:r>
+    </w:p>
+    <w:p>
+      <w:pPr>
+        <w:numPr>
+          <w:ilvl w:val="0"/>
+          <w:numId w:val="1"/>
+        </w:numPr>
+        <w:rPr>
+          <w:lang w:val="es-CO"/>
+        </w:rPr>
+      </w:pPr>
+      <w:r>
+        <w:rPr>
+          <w:lang w:val="es-CO"/>
+        </w:rPr>
+        <w:t>Utilización de funciones</w:t>
+      </w:r>
+      <w:r>
+        <w:rPr>
+          <w:lang w:val="es-CO"/>
+        </w:rPr>
+        <w:t>.</w:t>
+      </w:r>
+    </w:p>
+    <w:p>
+      <w:pPr>
+        <w:ind w:left="720"/>
+        <w:rPr>
+          <w:lang w:val="es-CO"/>
+        </w:rPr>
+      </w:pPr>
+    </w:p>
+    <w:p>
+      <w:pPr>
+        <w:rPr>
+          <w:lang w:val="es-CO"/>
+        </w:rPr>
+      </w:pPr>
     </w:p>
     <w:sectPr>
       <w:pgSz w:w="12240" w:h="15840"/>
-      <w:pgMar w:top="1417" w:right="1701" w:bottom="1417" w:left="1701" w:header="708" w:footer="708" w:gutter="0"/>
+      <w:pgMar w:top="1440" w:right="1440" w:bottom="1440" w:left="1440" w:header="708" w:footer="708" w:gutter="0"/>
       <w:cols w:space="708"/>
       <w:docGrid w:linePitch="360"/>
     </w:sectPr>
   </w:body>
 </w:document>
+</file>
+
+<file path=word/numbering.xml><?xml version="1.0" encoding="utf-8"?>
+<w:numbering xmlns:wpc="http://schemas.microsoft.com/office/word/2010/wordprocessingCanvas" xmlns:cx="http://schemas.microsoft.com/office/drawing/2014/chartex" xmlns:cx1="http://schemas.microsoft.com/office/drawing/2015/9/8/chartex" xmlns:cx2="http://schemas.microsoft.com/office/drawing/2015/10/21/chartex" xmlns:cx3="http://schemas.microsoft.com/office/drawing/2016/5/9/chartex" xmlns:cx4="http://schemas.microsoft.com/office/drawing/2016/5/10/chartex" xmlns:cx5="http://schemas.microsoft.com/office/drawing/2016/5/11/chartex" xmlns:cx6="http://schemas.microsoft.com/office/drawing/2016/5/12/chartex" xmlns:cx7="http://schemas.microsoft.com/office/drawing/2016/5/13/chartex" xmlns:cx8="http://schemas.microsoft.com/office/drawing/2016/5/14/chartex" xmlns:mc="http://schemas.openxmlformats.org/markup-compatibility/2006" xmlns:aink="http://schemas.microsoft.com/office/drawing/2016/ink" xmlns:am3d="http://schemas.microsoft.com/office/drawing/2017/model3d" xmlns:o="urn:schemas-microsoft-com:office:office" xmlns:oel="http://schemas.microsoft.com/office/2019/extlst" xmlns:r="http://schemas.openxmlformats.org/officeDocument/2006/relationships" xmlns:m="http://schemas.openxmlformats.org/officeDocument/2006/math" xmlns:v="urn:schemas-microsoft-com:vml" xmlns:wp14="http://schemas.microsoft.com/office/word/2010/wordprocessingDrawing" xmlns:wp="http://schemas.openxmlformats.org/drawingml/2006/wordprocessingDrawing" xmlns:w10="urn:schemas-microsoft-com:office:word" xmlns:w="http://schemas.openxmlformats.org/wordprocessingml/2006/main" xmlns:w14="http://schemas.microsoft.com/office/word/2010/wordml" xmlns:w15="http://schemas.microsoft.com/office/word/2012/wordml" xmlns:w16cex="http://schemas.microsoft.com/office/word/2018/wordml/cex" xmlns:w16cid="http://schemas.microsoft.com/office/word/2016/wordml/cid" xmlns:w16="http://schemas.microsoft.com/office/word/2018/wordml" xmlns:w16du="http://schemas.microsoft.com/office/word/2023/wordml/word16du" xmlns:w16sdtdh="http://schemas.microsoft.com/office/word/2020/wordml/sdtdatahash" xmlns:w16sdtfl="http://schemas.microsoft.com/office/word/2024/wordml/sdtformatlock" xmlns:w16se="http://schemas.microsoft.com/office/word/2015/wordml/symex" xmlns:wpg="http://schemas.microsoft.com/office/word/2010/wordprocessingGroup" xmlns:wpi="http://schemas.microsoft.com/office/word/2010/wordprocessingInk" xmlns:wne="http://schemas.microsoft.com/office/word/2006/wordml" xmlns:wps="http://schemas.microsoft.com/office/word/2010/wordprocessingShape" mc:Ignorable="w14 w15 w16se w16cid w16 w16cex w16sdtdh w16sdtfl w16du wp14">
+  <w:abstractNum w:abstractNumId="0" w15:restartNumberingAfterBreak="0">
+    <w:nsid w:val="1BE6748B"/>
+    <w:multiLevelType w:val="multilevel"/>
+    <w:tmpl w:val="94D66396"/>
+    <w:lvl w:ilvl="0">
+      <w:start w:val="1"/>
+      <w:numFmt w:val="bullet"/>
+      <w:lvlText w:val=""/>
+      <w:lvlJc w:val="left"/>
+      <w:pPr>
+        <w:tabs>
+          <w:tab w:val="num" w:pos="720"/>
+        </w:tabs>
+        <w:ind w:left="720" w:hanging="360"/>
+      </w:pPr>
+      <w:rPr>
+        <w:rFonts w:ascii="Symbol" w:hAnsi="Symbol" w:hint="default"/>
+        <w:sz w:val="20"/>
+      </w:rPr>
+    </w:lvl>
+    <w:lvl w:ilvl="1" w:tentative="1">
+      <w:start w:val="1"/>
+      <w:numFmt w:val="bullet"/>
+      <w:lvlText w:val="o"/>
+      <w:lvlJc w:val="left"/>
+      <w:pPr>
+        <w:tabs>
+          <w:tab w:val="num" w:pos="1440"/>
+        </w:tabs>
+        <w:ind w:left="1440" w:hanging="360"/>
+      </w:pPr>
+      <w:rPr>
+        <w:rFonts w:ascii="Courier New" w:hAnsi="Courier New" w:hint="default"/>
+        <w:sz w:val="20"/>
+      </w:rPr>
+    </w:lvl>
+    <w:lvl w:ilvl="2" w:tentative="1">
+      <w:start w:val="1"/>
+      <w:numFmt w:val="bullet"/>
+      <w:lvlText w:val=""/>
+      <w:lvlJc w:val="left"/>
+      <w:pPr>
+        <w:tabs>
+          <w:tab w:val="num" w:pos="2160"/>
+        </w:tabs>
+        <w:ind w:left="2160" w:hanging="360"/>
+      </w:pPr>
+      <w:rPr>
+        <w:rFonts w:ascii="Wingdings" w:hAnsi="Wingdings" w:hint="default"/>
+        <w:sz w:val="20"/>
+      </w:rPr>
+    </w:lvl>
+    <w:lvl w:ilvl="3" w:tentative="1">
+      <w:start w:val="1"/>
+      <w:numFmt w:val="bullet"/>
+      <w:lvlText w:val=""/>
+      <w:lvlJc w:val="left"/>
+      <w:pPr>
+        <w:tabs>
+          <w:tab w:val="num" w:pos="2880"/>
+        </w:tabs>
+        <w:ind w:left="2880" w:hanging="360"/>
+      </w:pPr>
+      <w:rPr>
+        <w:rFonts w:ascii="Wingdings" w:hAnsi="Wingdings" w:hint="default"/>
+        <w:sz w:val="20"/>
+      </w:rPr>
+    </w:lvl>
+    <w:lvl w:ilvl="4" w:tentative="1">
+      <w:start w:val="1"/>
+      <w:numFmt w:val="bullet"/>
+      <w:lvlText w:val=""/>
+      <w:lvlJc w:val="left"/>
+      <w:pPr>
+        <w:tabs>
+          <w:tab w:val="num" w:pos="3600"/>
+        </w:tabs>
+        <w:ind w:left="3600" w:hanging="360"/>
+      </w:pPr>
+      <w:rPr>
+        <w:rFonts w:ascii="Wingdings" w:hAnsi="Wingdings" w:hint="default"/>
+        <w:sz w:val="20"/>
+      </w:rPr>
+    </w:lvl>
+    <w:lvl w:ilvl="5" w:tentative="1">
+      <w:start w:val="1"/>
+      <w:numFmt w:val="bullet"/>
+      <w:lvlText w:val=""/>
+      <w:lvlJc w:val="left"/>
+      <w:pPr>
+        <w:tabs>
+          <w:tab w:val="num" w:pos="4320"/>
+        </w:tabs>
+        <w:ind w:left="4320" w:hanging="360"/>
+      </w:pPr>
+      <w:rPr>
+        <w:rFonts w:ascii="Wingdings" w:hAnsi="Wingdings" w:hint="default"/>
+        <w:sz w:val="20"/>
+      </w:rPr>
+    </w:lvl>
+    <w:lvl w:ilvl="6" w:tentative="1">
+      <w:start w:val="1"/>
+      <w:numFmt w:val="bullet"/>
+      <w:lvlText w:val=""/>
+      <w:lvlJc w:val="left"/>
+      <w:pPr>
+        <w:tabs>
+          <w:tab w:val="num" w:pos="5040"/>
+        </w:tabs>
+        <w:ind w:left="5040" w:hanging="360"/>
+      </w:pPr>
+      <w:rPr>
+        <w:rFonts w:ascii="Wingdings" w:hAnsi="Wingdings" w:hint="default"/>
+        <w:sz w:val="20"/>
+      </w:rPr>
+    </w:lvl>
+    <w:lvl w:ilvl="7" w:tentative="1">
+      <w:start w:val="1"/>
+      <w:numFmt w:val="bullet"/>
+      <w:lvlText w:val=""/>
+      <w:lvlJc w:val="left"/>
+      <w:pPr>
+        <w:tabs>
+          <w:tab w:val="num" w:pos="5760"/>
+        </w:tabs>
+        <w:ind w:left="5760" w:hanging="360"/>
+      </w:pPr>
+      <w:rPr>
+        <w:rFonts w:ascii="Wingdings" w:hAnsi="Wingdings" w:hint="default"/>
+        <w:sz w:val="20"/>
+      </w:rPr>
+    </w:lvl>
+    <w:lvl w:ilvl="8" w:tentative="1">
+      <w:start w:val="1"/>
+      <w:numFmt w:val="bullet"/>
+      <w:lvlText w:val=""/>
+      <w:lvlJc w:val="left"/>
+      <w:pPr>
+        <w:tabs>
+          <w:tab w:val="num" w:pos="6480"/>
+        </w:tabs>
+        <w:ind w:left="6480" w:hanging="360"/>
+      </w:pPr>
+      <w:rPr>
+        <w:rFonts w:ascii="Wingdings" w:hAnsi="Wingdings" w:hint="default"/>
+        <w:sz w:val="20"/>
+      </w:rPr>
+    </w:lvl>
+  </w:abstractNum>
+  <w:num w:numId="1" w16cid:durableId="116266592">
+    <w:abstractNumId w:val="0"/>
+  </w:num>
+</w:numbering>
 </file>
 
 <file path=word/styles.xml><?xml version="1.0" encoding="utf-8"?>
@@ -628,7 +1259,6 @@
   <w:style w:type="character" w:default="1" w:styleId="Fuentedeprrafopredeter">
     <w:name w:val="Default Paragraph Font"/>
     <w:uiPriority w:val="1"/>
-    <w:semiHidden/>
     <w:unhideWhenUsed/>
   </w:style>
   <w:style w:type="table" w:default="1" w:styleId="Tablanormal">

</xml_diff>

<commit_message>
descripcion del problema y analisis de solucion
</commit_message>
<xml_diff>
--- a/ANALISIS PROYECTO TETRIS.docx
+++ b/ANALISIS PROYECTO TETRIS.docx
@@ -476,7 +476,440 @@
     </w:p>
     <w:p>
       <w:pPr>
-        <w:ind w:left="720"/>
+        <w:numPr>
+          <w:ilvl w:val="0"/>
+          <w:numId w:val="1"/>
+        </w:numPr>
+        <w:rPr>
+          <w:lang w:val="es-CO"/>
+        </w:rPr>
+      </w:pPr>
+      <w:proofErr w:type="spellStart"/>
+      <w:r>
+        <w:rPr>
+          <w:lang w:val="es-CO"/>
+        </w:rPr>
+        <w:t>Utilizacion</w:t>
+      </w:r>
+      <w:proofErr w:type="spellEnd"/>
+      <w:r>
+        <w:rPr>
+          <w:lang w:val="es-CO"/>
+        </w:rPr>
+        <w:t xml:space="preserve"> de punteros </w:t>
+      </w:r>
+    </w:p>
+    <w:p>
+      <w:pPr>
+        <w:ind w:left="360"/>
+        <w:rPr>
+          <w:lang w:val="es-CO"/>
+        </w:rPr>
+      </w:pPr>
+    </w:p>
+    <w:p>
+      <w:pPr>
+        <w:ind w:left="360"/>
+        <w:rPr>
+          <w:lang w:val="es-CO"/>
+        </w:rPr>
+      </w:pPr>
+    </w:p>
+    <w:p>
+      <w:pPr>
+        <w:ind w:left="360"/>
+        <w:rPr>
+          <w:rFonts w:ascii="Arial" w:hAnsi="Arial" w:cs="Arial"/>
+          <w:b/>
+          <w:bCs/>
+          <w:lang w:val="es-CO"/>
+        </w:rPr>
+      </w:pPr>
+      <w:r>
+        <w:rPr>
+          <w:rFonts w:ascii="Arial" w:hAnsi="Arial" w:cs="Arial"/>
+          <w:b/>
+          <w:bCs/>
+          <w:lang w:val="es-CO"/>
+        </w:rPr>
+        <w:t>Descripción del problema</w:t>
+      </w:r>
+    </w:p>
+    <w:p>
+      <w:pPr>
+        <w:ind w:left="360"/>
+        <w:rPr>
+          <w:rFonts w:ascii="Arial" w:hAnsi="Arial" w:cs="Arial"/>
+          <w:lang w:val="es-CO"/>
+        </w:rPr>
+      </w:pPr>
+      <w:r>
+        <w:rPr>
+          <w:rFonts w:ascii="Arial" w:hAnsi="Arial" w:cs="Arial"/>
+          <w:lang w:val="es-CO"/>
+        </w:rPr>
+        <w:t>Buscando en la red investigue sobre e</w:t>
+      </w:r>
+      <w:r>
+        <w:rPr>
+          <w:rFonts w:ascii="Arial" w:hAnsi="Arial" w:cs="Arial"/>
+          <w:lang w:val="es-CO"/>
+        </w:rPr>
+        <w:t>l juego Tetris</w:t>
+      </w:r>
+      <w:r>
+        <w:rPr>
+          <w:rFonts w:ascii="Arial" w:hAnsi="Arial" w:cs="Arial"/>
+          <w:lang w:val="es-CO"/>
+        </w:rPr>
+        <w:t xml:space="preserve"> ya que no estoy muy familiarizado con él, encontré </w:t>
+      </w:r>
+      <w:r>
+        <w:rPr>
+          <w:rFonts w:ascii="Arial" w:hAnsi="Arial" w:cs="Arial"/>
+          <w:lang w:val="es-CO"/>
+        </w:rPr>
+        <w:t xml:space="preserve">que </w:t>
+      </w:r>
+      <w:r>
+        <w:rPr>
+          <w:rFonts w:ascii="Arial" w:hAnsi="Arial" w:cs="Arial"/>
+          <w:lang w:val="es-CO"/>
+        </w:rPr>
+        <w:t>consiste</w:t>
+      </w:r>
+      <w:r>
+        <w:rPr>
+          <w:rFonts w:ascii="Arial" w:hAnsi="Arial" w:cs="Arial"/>
+          <w:lang w:val="es-CO"/>
+        </w:rPr>
+        <w:t xml:space="preserve"> en acomodar diferentes piezas dentro de un tablero</w:t>
+      </w:r>
+      <w:r>
+        <w:rPr>
+          <w:rFonts w:ascii="Arial" w:hAnsi="Arial" w:cs="Arial"/>
+          <w:lang w:val="es-CO"/>
+        </w:rPr>
+        <w:t xml:space="preserve"> donde se </w:t>
+      </w:r>
+      <w:r>
+        <w:rPr>
+          <w:rFonts w:ascii="Arial" w:hAnsi="Arial" w:cs="Arial"/>
+          <w:lang w:val="es-CO"/>
+        </w:rPr>
+        <w:t xml:space="preserve">forman </w:t>
+      </w:r>
+      <w:r>
+        <w:rPr>
+          <w:rFonts w:ascii="Arial" w:hAnsi="Arial" w:cs="Arial"/>
+          <w:lang w:val="es-CO"/>
+        </w:rPr>
+        <w:t>filas</w:t>
+      </w:r>
+      <w:r>
+        <w:rPr>
+          <w:rFonts w:ascii="Arial" w:hAnsi="Arial" w:cs="Arial"/>
+          <w:lang w:val="es-CO"/>
+        </w:rPr>
+        <w:t xml:space="preserve"> completas. Cada pieza está formada por bloques que pueden moverse dentro del tablero hacia la izquierda, derecha o hacia abajo, además de poder rotarse. A medida que el juego avanza, las piezas van ocupando espacios en el tablero y el jugador debe ubicarlas correctamente para evitar que se acumulen hasta la parte superior.</w:t>
+      </w:r>
+    </w:p>
+    <w:p>
+      <w:pPr>
+        <w:ind w:left="360"/>
+        <w:rPr>
+          <w:rFonts w:ascii="Arial" w:hAnsi="Arial" w:cs="Arial"/>
+          <w:lang w:val="es-CO"/>
+        </w:rPr>
+      </w:pPr>
+      <w:r>
+        <w:rPr>
+          <w:rFonts w:ascii="Arial" w:hAnsi="Arial" w:cs="Arial"/>
+          <w:lang w:val="es-CO"/>
+        </w:rPr>
+        <w:t>Cuando una fila del tablero se llena completamente con bloques, esta desaparece y las filas superiores descienden una posición. El juego continúa generando nuevas piezas hasta que ya no sea posible ubicar una nueva pieza en la parte superior del tablero.</w:t>
+      </w:r>
+    </w:p>
+    <w:p>
+      <w:pPr>
+        <w:ind w:left="360"/>
+        <w:rPr>
+          <w:rFonts w:ascii="Arial" w:hAnsi="Arial" w:cs="Arial"/>
+          <w:lang w:val="es-CO"/>
+        </w:rPr>
+      </w:pPr>
+      <w:r>
+        <w:rPr>
+          <w:rFonts w:ascii="Arial" w:hAnsi="Arial" w:cs="Arial"/>
+          <w:lang w:val="es-CO"/>
+        </w:rPr>
+        <w:t xml:space="preserve">En este proyecto se desarrollará una versión </w:t>
+      </w:r>
+      <w:r>
+        <w:rPr>
+          <w:rFonts w:ascii="Arial" w:hAnsi="Arial" w:cs="Arial"/>
+          <w:lang w:val="es-CO"/>
+        </w:rPr>
+        <w:t>básica</w:t>
+      </w:r>
+      <w:r>
+        <w:rPr>
+          <w:rFonts w:ascii="Arial" w:hAnsi="Arial" w:cs="Arial"/>
+          <w:lang w:val="es-CO"/>
+        </w:rPr>
+        <w:t xml:space="preserve"> del juego Tetris que funcionará en consola utilizando el lenguaje de programación C++. El sistema deberá permitir representar el tablero, generar piezas, moverlas dentro del tablero y detectar colisiones con los bordes o con otras piezas.</w:t>
+      </w:r>
+    </w:p>
+    <w:p>
+      <w:pPr>
+        <w:ind w:left="360"/>
+        <w:rPr>
+          <w:rFonts w:ascii="Arial" w:hAnsi="Arial" w:cs="Arial"/>
+          <w:lang w:val="es-CO"/>
+        </w:rPr>
+      </w:pPr>
+    </w:p>
+    <w:p>
+      <w:pPr>
+        <w:ind w:left="360"/>
+        <w:rPr>
+          <w:rFonts w:ascii="Arial" w:hAnsi="Arial" w:cs="Arial"/>
+          <w:b/>
+          <w:bCs/>
+          <w:lang w:val="es-CO"/>
+        </w:rPr>
+      </w:pPr>
+      <w:r>
+        <w:rPr>
+          <w:rFonts w:ascii="Arial" w:hAnsi="Arial" w:cs="Arial"/>
+          <w:b/>
+          <w:bCs/>
+          <w:lang w:val="es-CO"/>
+        </w:rPr>
+        <w:t xml:space="preserve">Análisis de la alternativa de solución </w:t>
+      </w:r>
+    </w:p>
+    <w:p>
+      <w:pPr>
+        <w:ind w:left="360"/>
+        <w:rPr>
+          <w:rFonts w:ascii="Arial" w:hAnsi="Arial" w:cs="Arial"/>
+          <w:lang w:val="es-CO"/>
+        </w:rPr>
+      </w:pPr>
+      <w:r>
+        <w:rPr>
+          <w:rFonts w:ascii="Arial" w:hAnsi="Arial" w:cs="Arial"/>
+          <w:lang w:val="es-CO"/>
+        </w:rPr>
+        <w:t>S</w:t>
+      </w:r>
+      <w:r>
+        <w:rPr>
+          <w:rFonts w:ascii="Arial" w:hAnsi="Arial" w:cs="Arial"/>
+          <w:lang w:val="es-CO"/>
+        </w:rPr>
+        <w:t xml:space="preserve">e propone representar el tablero del juego utilizando bits. En esta representación cada posición del tablero puede tener un valor de </w:t>
+      </w:r>
+      <w:r>
+        <w:rPr>
+          <w:rFonts w:ascii="Arial" w:hAnsi="Arial" w:cs="Arial"/>
+          <w:b/>
+          <w:bCs/>
+          <w:lang w:val="es-CO"/>
+        </w:rPr>
+        <w:t>0 o 1</w:t>
+      </w:r>
+      <w:r>
+        <w:rPr>
+          <w:rFonts w:ascii="Arial" w:hAnsi="Arial" w:cs="Arial"/>
+          <w:lang w:val="es-CO"/>
+        </w:rPr>
+        <w:t xml:space="preserve">, donde </w:t>
+      </w:r>
+      <w:r>
+        <w:rPr>
+          <w:rFonts w:ascii="Arial" w:hAnsi="Arial" w:cs="Arial"/>
+          <w:b/>
+          <w:bCs/>
+          <w:lang w:val="es-CO"/>
+        </w:rPr>
+        <w:t>0 representa un espacio vacío y 1 representa un bloque ocupado</w:t>
+      </w:r>
+      <w:r>
+        <w:rPr>
+          <w:rFonts w:ascii="Arial" w:hAnsi="Arial" w:cs="Arial"/>
+          <w:lang w:val="es-CO"/>
+        </w:rPr>
+        <w:t>.</w:t>
+      </w:r>
+    </w:p>
+    <w:p>
+      <w:pPr>
+        <w:ind w:left="360"/>
+        <w:rPr>
+          <w:rFonts w:ascii="Arial" w:hAnsi="Arial" w:cs="Arial"/>
+          <w:lang w:val="es-CO"/>
+        </w:rPr>
+      </w:pPr>
+      <w:r>
+        <w:rPr>
+          <w:rFonts w:ascii="Arial" w:hAnsi="Arial" w:cs="Arial"/>
+          <w:lang w:val="es-CO"/>
+        </w:rPr>
+        <w:t>E</w:t>
+      </w:r>
+      <w:r>
+        <w:rPr>
+          <w:rFonts w:ascii="Arial" w:hAnsi="Arial" w:cs="Arial"/>
+          <w:lang w:val="es-CO"/>
+        </w:rPr>
+        <w:t xml:space="preserve">l ancho del tablero debe ser múltiplo de 8, cada fila del tablero puede representarse utilizando grupos de bits. </w:t>
+      </w:r>
+      <w:r>
+        <w:rPr>
+          <w:rFonts w:ascii="Arial" w:hAnsi="Arial" w:cs="Arial"/>
+          <w:lang w:val="es-CO"/>
+        </w:rPr>
+        <w:t xml:space="preserve">Podemos </w:t>
+      </w:r>
+      <w:r>
+        <w:rPr>
+          <w:rFonts w:ascii="Arial" w:hAnsi="Arial" w:cs="Arial"/>
+          <w:lang w:val="es-CO"/>
+        </w:rPr>
+        <w:t xml:space="preserve">almacenar la información del tablero </w:t>
+      </w:r>
+      <w:r>
+        <w:rPr>
+          <w:rFonts w:ascii="Arial" w:hAnsi="Arial" w:cs="Arial"/>
+          <w:lang w:val="es-CO"/>
+        </w:rPr>
+        <w:t xml:space="preserve">utilizando menos memoria, y asi </w:t>
+      </w:r>
+      <w:proofErr w:type="gramStart"/>
+      <w:r>
+        <w:rPr>
+          <w:rFonts w:ascii="Arial" w:hAnsi="Arial" w:cs="Arial"/>
+          <w:lang w:val="es-CO"/>
+        </w:rPr>
+        <w:t xml:space="preserve">se </w:t>
+      </w:r>
+      <w:r>
+        <w:rPr>
+          <w:rFonts w:ascii="Arial" w:hAnsi="Arial" w:cs="Arial"/>
+          <w:lang w:val="es-CO"/>
+        </w:rPr>
+        <w:t xml:space="preserve"> facilita</w:t>
+      </w:r>
+      <w:proofErr w:type="gramEnd"/>
+      <w:r>
+        <w:rPr>
+          <w:rFonts w:ascii="Arial" w:hAnsi="Arial" w:cs="Arial"/>
+          <w:lang w:val="es-CO"/>
+        </w:rPr>
+        <w:t xml:space="preserve"> la manipulación de los bloques.</w:t>
+      </w:r>
+    </w:p>
+    <w:p>
+      <w:pPr>
+        <w:ind w:left="360"/>
+        <w:rPr>
+          <w:rFonts w:ascii="Arial" w:hAnsi="Arial" w:cs="Arial"/>
+          <w:lang w:val="es-CO"/>
+        </w:rPr>
+      </w:pPr>
+      <w:r>
+        <w:rPr>
+          <w:rFonts w:ascii="Arial" w:hAnsi="Arial" w:cs="Arial"/>
+          <w:lang w:val="es-CO"/>
+        </w:rPr>
+        <w:t>M</w:t>
+      </w:r>
+      <w:r>
+        <w:rPr>
+          <w:rFonts w:ascii="Arial" w:hAnsi="Arial" w:cs="Arial"/>
+          <w:lang w:val="es-CO"/>
+        </w:rPr>
+        <w:t xml:space="preserve">ediante el uso de operaciones </w:t>
+      </w:r>
+      <w:proofErr w:type="spellStart"/>
+      <w:r>
+        <w:rPr>
+          <w:rFonts w:ascii="Arial" w:hAnsi="Arial" w:cs="Arial"/>
+          <w:lang w:val="es-CO"/>
+        </w:rPr>
+        <w:t>bitwise</w:t>
+      </w:r>
+      <w:proofErr w:type="spellEnd"/>
+      <w:r>
+        <w:rPr>
+          <w:rFonts w:ascii="Arial" w:hAnsi="Arial" w:cs="Arial"/>
+          <w:lang w:val="es-CO"/>
+        </w:rPr>
+        <w:t xml:space="preserve"> es posible realizar diferentes operaciones dentro del juego. Por ejemplo, se pueden detectar colisiones entre las piezas y el tablero, o mover las piezas hacia la izquierda o la derecha mediante desplazamientos de bits.</w:t>
+      </w:r>
+    </w:p>
+    <w:p>
+      <w:pPr>
+        <w:ind w:left="360"/>
+        <w:rPr>
+          <w:rFonts w:ascii="Arial" w:hAnsi="Arial" w:cs="Arial"/>
+          <w:lang w:val="es-CO"/>
+        </w:rPr>
+      </w:pPr>
+      <w:r>
+        <w:rPr>
+          <w:rFonts w:ascii="Arial" w:hAnsi="Arial" w:cs="Arial"/>
+          <w:lang w:val="es-CO"/>
+        </w:rPr>
+        <w:t xml:space="preserve">Asi podemos </w:t>
+      </w:r>
+      <w:r>
+        <w:rPr>
+          <w:rFonts w:ascii="Arial" w:hAnsi="Arial" w:cs="Arial"/>
+          <w:lang w:val="es-CO"/>
+        </w:rPr>
+        <w:t>aplicar</w:t>
+      </w:r>
+      <w:r>
+        <w:rPr>
+          <w:rFonts w:ascii="Arial" w:hAnsi="Arial" w:cs="Arial"/>
+          <w:lang w:val="es-CO"/>
+        </w:rPr>
+        <w:t xml:space="preserve"> los conceptos vistos en clase relacionados con manipulación de bits, punteros y arreglos para representar el estado del juego.</w:t>
+      </w:r>
+    </w:p>
+    <w:p>
+      <w:pPr>
+        <w:ind w:left="360"/>
+        <w:rPr>
+          <w:rFonts w:ascii="Arial" w:hAnsi="Arial" w:cs="Arial"/>
+          <w:lang w:val="es-CO"/>
+        </w:rPr>
+      </w:pPr>
+    </w:p>
+    <w:p>
+      <w:pPr>
+        <w:ind w:left="360"/>
+        <w:rPr>
+          <w:rFonts w:ascii="Arial" w:hAnsi="Arial" w:cs="Arial"/>
+          <w:lang w:val="es-CO"/>
+        </w:rPr>
+      </w:pPr>
+    </w:p>
+    <w:p>
+      <w:pPr>
+        <w:ind w:left="360"/>
+        <w:rPr>
+          <w:rFonts w:ascii="Arial" w:hAnsi="Arial" w:cs="Arial"/>
+          <w:lang w:val="es-CO"/>
+        </w:rPr>
+      </w:pPr>
+    </w:p>
+    <w:p>
+      <w:pPr>
+        <w:ind w:left="360"/>
         <w:rPr>
           <w:lang w:val="es-CO"/>
         </w:rPr>

</xml_diff>